<commit_message>
Array and Two pointer
</commit_message>
<xml_diff>
--- a/src/main/java/org/dsa/PradeepDSASheet/DSA Sheet.docx
+++ b/src/main/java/org/dsa/PradeepDSASheet/DSA Sheet.docx
@@ -419,12 +419,16 @@
                 <w:numId w:val="2"/>
               </w:numPr>
               <w:spacing w:before="40" w:after="40" w:line="240" w:lineRule="auto"/>
-            </w:pPr>
-            <w:r>
-              <w:rPr>
-                <w:color w:val="1B5E20"/>
-              </w:rPr>
-              <w:t>First Missing Positive (Cycling Sort)</w:t>
+              <w:rPr>
+                <w:highlight w:val="yellow"/>
+              </w:rPr>
+            </w:pPr>
+            <w:r>
+              <w:rPr>
+                <w:color w:val="1B5E20"/>
+                <w:highlight w:val="yellow"/>
+              </w:rPr>
+              <w:t>Missing Number</w:t>
             </w:r>
           </w:p>
           <w:p>
@@ -439,6 +443,31 @@
               <w:rPr>
                 <w:color w:val="1B5E20"/>
               </w:rPr>
+              <w:t>First Missing Positive</w:t>
+            </w:r>
+            <w:r>
+              <w:rPr>
+                <w:color w:val="1B5E20"/>
+              </w:rPr>
+              <w:t xml:space="preserve"> (Cycling Sort)</w:t>
+            </w:r>
+          </w:p>
+          <w:p>
+            <w:pPr>
+              <w:numPr>
+                <w:ilvl w:val="0"/>
+                <w:numId w:val="2"/>
+              </w:numPr>
+              <w:spacing w:before="40" w:after="40" w:line="240" w:lineRule="auto"/>
+              <w:rPr>
+                <w:highlight w:val="yellow"/>
+              </w:rPr>
+            </w:pPr>
+            <w:r>
+              <w:rPr>
+                <w:color w:val="1B5E20"/>
+                <w:highlight w:val="yellow"/>
+              </w:rPr>
               <w:t>LC 287 – Find Duplicate Number</w:t>
             </w:r>
           </w:p>
@@ -483,8 +512,15 @@
             <w:r>
               <w:rPr>
                 <w:color w:val="1B5E20"/>
+                <w:highlight w:val="yellow"/>
               </w:rPr>
               <w:t>LC 442 – Find All Duplicates</w:t>
+            </w:r>
+            <w:r>
+              <w:rPr>
+                <w:color w:val="1B5E20"/>
+              </w:rPr>
+              <w:t xml:space="preserve"> </w:t>
             </w:r>
           </w:p>
         </w:tc>
@@ -654,6 +690,34 @@
           </w:p>
         </w:tc>
       </w:tr>
+      <w:tr>
+        <w:tc>
+          <w:tcPr>
+            <w:tcW w:w="9360" w:type="dxa"/>
+            <w:tcBorders>
+              <w:top w:val="single" w:sz="4" w:space="0" w:color="66BB6A"/>
+              <w:left w:val="single" w:sz="4" w:space="0" w:color="66BB6A"/>
+              <w:bottom w:val="single" w:sz="4" w:space="0" w:color="66BB6A"/>
+              <w:right w:val="single" w:sz="4" w:space="0" w:color="66BB6A"/>
+            </w:tcBorders>
+            <w:shd w:val="clear" w:color="auto" w:fill="E8F5E9"/>
+            <w:tcMar>
+              <w:top w:w="120" w:type="dxa"/>
+              <w:left w:w="200" w:type="dxa"/>
+              <w:bottom w:w="120" w:type="dxa"/>
+              <w:right w:w="200" w:type="dxa"/>
+            </w:tcMar>
+          </w:tcPr>
+          <w:p>
+            <w:pPr>
+              <w:spacing w:before="40" w:after="40" w:line="240" w:lineRule="auto"/>
+              <w:rPr>
+                <w:color w:val="1B5E20"/>
+              </w:rPr>
+            </w:pPr>
+          </w:p>
+        </w:tc>
+      </w:tr>
     </w:tbl>
     <w:p>
       <w:pPr>
@@ -709,6 +773,7 @@
                 <w:sz w:val="24"/>
                 <w:szCs w:val="24"/>
               </w:rPr>
+              <w:lastRenderedPageBreak/>
               <w:t xml:space="preserve">3. </w:t>
             </w:r>
             <w:r>
@@ -754,7 +819,6 @@
               <w:rPr>
                 <w:color w:val="1B5E20"/>
               </w:rPr>
-              <w:lastRenderedPageBreak/>
               <w:t>Longest Substring Without Repeating Characters</w:t>
             </w:r>
           </w:p>

</xml_diff>

<commit_message>
prefix sum:  Minimum Size Subarray Sum
</commit_message>
<xml_diff>
--- a/src/main/java/org/dsa/PradeepDSASheet/DSA Sheet.docx
+++ b/src/main/java/org/dsa/PradeepDSASheet/DSA Sheet.docx
@@ -1017,12 +1017,34 @@
                 <w:numId w:val="2"/>
               </w:numPr>
               <w:spacing w:before="40" w:after="40" w:line="240" w:lineRule="auto"/>
-            </w:pPr>
-            <w:r>
-              <w:rPr>
-                <w:color w:val="1B5E20"/>
+              <w:rPr>
+                <w:highlight w:val="yellow"/>
+              </w:rPr>
+            </w:pPr>
+            <w:r>
+              <w:rPr>
+                <w:color w:val="1B5E20"/>
+                <w:highlight w:val="yellow"/>
               </w:rPr>
               <w:t>Continuous Subarray Sum</w:t>
+            </w:r>
+          </w:p>
+          <w:p>
+            <w:pPr>
+              <w:numPr>
+                <w:ilvl w:val="0"/>
+                <w:numId w:val="2"/>
+              </w:numPr>
+              <w:spacing w:before="40" w:after="40" w:line="240" w:lineRule="auto"/>
+              <w:rPr>
+                <w:highlight w:val="yellow"/>
+              </w:rPr>
+            </w:pPr>
+            <w:r>
+              <w:rPr>
+                <w:highlight w:val="yellow"/>
+              </w:rPr>
+              <w:t>Minimum Size Subarray Sum</w:t>
             </w:r>
           </w:p>
           <w:p>
@@ -1607,6 +1629,7 @@
                 <w:sz w:val="24"/>
                 <w:szCs w:val="24"/>
               </w:rPr>
+              <w:lastRenderedPageBreak/>
               <w:t xml:space="preserve">8. </w:t>
             </w:r>
             <w:r>
@@ -1652,7 +1675,6 @@
               <w:rPr>
                 <w:color w:val="1B5E20"/>
               </w:rPr>
-              <w:lastRenderedPageBreak/>
               <w:t>Binary Search</w:t>
             </w:r>
           </w:p>
@@ -2438,6 +2460,7 @@
               <w:rPr>
                 <w:color w:val="1B5E20"/>
               </w:rPr>
+              <w:lastRenderedPageBreak/>
               <w:t>Binary Tree Level Order Traversal</w:t>
             </w:r>
           </w:p>
@@ -2468,7 +2491,6 @@
               <w:rPr>
                 <w:color w:val="1B5E20"/>
               </w:rPr>
-              <w:lastRenderedPageBreak/>
               <w:t>Minimum Depth of Binary Tree</w:t>
             </w:r>
           </w:p>
@@ -3294,6 +3316,7 @@
               <w:rPr>
                 <w:color w:val="1B5E20"/>
               </w:rPr>
+              <w:lastRenderedPageBreak/>
               <w:t>Jump Game</w:t>
             </w:r>
           </w:p>
@@ -3324,7 +3347,6 @@
               <w:rPr>
                 <w:color w:val="1B5E20"/>
               </w:rPr>
-              <w:lastRenderedPageBreak/>
               <w:t>Partition Labels</w:t>
             </w:r>
           </w:p>
@@ -4355,7 +4377,6 @@
   <w:style w:type="character" w:default="1" w:styleId="DefaultParagraphFont">
     <w:name w:val="Default Paragraph Font"/>
     <w:uiPriority w:val="1"/>
-    <w:semiHidden/>
     <w:unhideWhenUsed/>
   </w:style>
   <w:style w:type="table" w:default="1" w:styleId="TableNormal">
@@ -4696,6 +4717,29 @@
       </w:tblCellMar>
     </w:tblPr>
   </w:style>
+  <w:style w:type="character" w:styleId="Hyperlink">
+    <w:name w:val="Hyperlink"/>
+    <w:basedOn w:val="DefaultParagraphFont"/>
+    <w:uiPriority w:val="99"/>
+    <w:unhideWhenUsed/>
+    <w:rsid w:val="00FB557B"/>
+    <w:rPr>
+      <w:color w:val="0000FF" w:themeColor="hyperlink"/>
+      <w:u w:val="single"/>
+    </w:rPr>
+  </w:style>
+  <w:style w:type="character" w:styleId="UnresolvedMention">
+    <w:name w:val="Unresolved Mention"/>
+    <w:basedOn w:val="DefaultParagraphFont"/>
+    <w:uiPriority w:val="99"/>
+    <w:semiHidden/>
+    <w:unhideWhenUsed/>
+    <w:rsid w:val="00FB557B"/>
+    <w:rPr>
+      <w:color w:val="605E5C"/>
+      <w:shd w:val="clear" w:color="auto" w:fill="E1DFDD"/>
+    </w:rPr>
+  </w:style>
 </w:styles>
 </file>
 

</xml_diff>

<commit_message>
Subarray Sums Divisible by K
</commit_message>
<xml_diff>
--- a/src/main/java/org/dsa/PradeepDSASheet/DSA Sheet.docx
+++ b/src/main/java/org/dsa/PradeepDSASheet/DSA Sheet.docx
@@ -1054,6 +1054,24 @@
                 <w:numId w:val="2"/>
               </w:numPr>
               <w:spacing w:before="40" w:after="40" w:line="240" w:lineRule="auto"/>
+              <w:rPr>
+                <w:highlight w:val="yellow"/>
+              </w:rPr>
+            </w:pPr>
+            <w:r>
+              <w:rPr>
+                <w:highlight w:val="yellow"/>
+              </w:rPr>
+              <w:t>Subarray Sums Divisible by K</w:t>
+            </w:r>
+          </w:p>
+          <w:p>
+            <w:pPr>
+              <w:numPr>
+                <w:ilvl w:val="0"/>
+                <w:numId w:val="2"/>
+              </w:numPr>
+              <w:spacing w:before="40" w:after="40" w:line="240" w:lineRule="auto"/>
             </w:pPr>
             <w:r>
               <w:rPr>
@@ -1629,7 +1647,6 @@
                 <w:sz w:val="24"/>
                 <w:szCs w:val="24"/>
               </w:rPr>
-              <w:lastRenderedPageBreak/>
               <w:t xml:space="preserve">8. </w:t>
             </w:r>
             <w:r>

</xml_diff>